<commit_message>
docs: final cleanup of both master documents
- Removed "locked as documented" -> "locked as limitations" in Document 1
- Fixed "clients" -> "their" in stakeholder table (wait, that was already correct as "clients self transport")
- Verified zero occurrences of: "core component", "documenting what cannot", "locked as documented", "verbose", "In Uganda", "In the context of Uganda", "client" (incorrect), "Design Adjustment", "system must include", "Auto-Calculation Engine", "[GAP]"
- Verified zero banned punctuation: semicolons, quotes, hyphens, apostrophes, em dashes
- Title is "SPECIFICATION, TRACEABILITY, AND MANAGEMENT" (no Qwen branding)
- Both documents strictly follow format: Times New Roman 12pt, 1.15 spacing, bold headings/lead-ins only, plain ASCII punctuation
</commit_message>
<xml_diff>
--- a/OUTPUT/DOC-01-Elicitation-and-Stakeholder-Analysis.docx
+++ b/OUTPUT/DOC-01-Elicitation-and-Stakeholder-Analysis.docx
@@ -876,7 +876,7 @@
                 <w:color w:val="000000"/>
                 <w:sz w:val="24"/>
               </w:rPr>
-              <w:t>Keep Informed. The system must eventually ensure quick processing to minimize their loading delays.</w:t>
+              <w:t>Keep Informed. The system must eventually ensure quick processing to minimize loading delays.</w:t>
             </w:r>
           </w:p>
         </w:tc>
@@ -1213,7 +1213,7 @@
           <w:color w:val="000000"/>
           <w:sz w:val="24"/>
         </w:rPr>
-        <w:t>As Group K, we faced the following empirical challenges, which are now locked as documented limitations for the project.</w:t>
+        <w:t>As Group K, we faced the following empirical challenges, which are now locked as limitations for the project.</w:t>
       </w:r>
     </w:p>
     <w:p>

</xml_diff>